<commit_message>
docs: anonymize dataset provenance (remove third-party brand references)
Co-authored-by: Juan David Prada Malagon  <pradamalagonjd@gmail.com>
</commit_message>
<xml_diff>
--- a/docs/DOE_prueba_tecnica.docx
+++ b/docs/DOE_prueba_tecnica.docx
@@ -104,34 +104,34 @@
           <w:sz w:val="22"/>
           <w:szCs w:val="22"/>
         </w:rPr>
-        <w:t>Prueba Técnica B</w:t>
-      </w:r>
-      <w:r>
-        <w:rPr>
-          <w:rFonts w:ascii="Calibri" w:eastAsia="Calibri" w:hAnsi="Calibri" w:cs="Calibri"/>
-          <w:color w:val="002060"/>
-          <w:sz w:val="22"/>
-          <w:szCs w:val="22"/>
-        </w:rPr>
-        <w:t>e</w:t>
-      </w:r>
-      <w:r>
-        <w:rPr>
-          <w:rFonts w:ascii="Calibri" w:eastAsia="Calibri" w:hAnsi="Calibri" w:cs="Calibri"/>
-          <w:color w:val="002060"/>
-          <w:sz w:val="22"/>
-          <w:szCs w:val="22"/>
-        </w:rPr>
-        <w:t>W</w:t>
-      </w:r>
-      <w:r>
-        <w:rPr>
-          <w:rFonts w:ascii="Calibri" w:eastAsia="Calibri" w:hAnsi="Calibri" w:cs="Calibri"/>
-          <w:color w:val="002060"/>
-          <w:sz w:val="22"/>
-          <w:szCs w:val="22"/>
-        </w:rPr>
-        <w:t>ay</w:t>
+        <w:t>Prueba Técnica </w:t>
+      </w:r>
+      <w:r>
+        <w:rPr>
+          <w:rFonts w:ascii="Calibri" w:eastAsia="Calibri" w:hAnsi="Calibri" w:cs="Calibri"/>
+          <w:color w:val="002060"/>
+          <w:sz w:val="22"/>
+          <w:szCs w:val="22"/>
+        </w:rPr>
+        <w:t/>
+      </w:r>
+      <w:r>
+        <w:rPr>
+          <w:rFonts w:ascii="Calibri" w:eastAsia="Calibri" w:hAnsi="Calibri" w:cs="Calibri"/>
+          <w:color w:val="002060"/>
+          <w:sz w:val="22"/>
+          <w:szCs w:val="22"/>
+        </w:rPr>
+        <w:t/>
+      </w:r>
+      <w:r>
+        <w:rPr>
+          <w:rFonts w:ascii="Calibri" w:eastAsia="Calibri" w:hAnsi="Calibri" w:cs="Calibri"/>
+          <w:color w:val="002060"/>
+          <w:sz w:val="22"/>
+          <w:szCs w:val="22"/>
+        </w:rPr>
+        <w:t/>
       </w:r>
     </w:p>
     <w:p>

</xml_diff>